<commit_message>
menyelesaikan jobsheet 13, 14, dan 15
</commit_message>
<xml_diff>
--- a/Laporan Jobsheet - Mohammad Al Hafis Hidayatulloh.docx
+++ b/Laporan Jobsheet - Mohammad Al Hafis Hidayatulloh.docx
@@ -390,76 +390,69 @@
         <w:jc w:val="center"/>
         <w:rPr>
           <w:rFonts w:ascii="Times New Roman" w:hAnsi="Times New Roman" w:cs="Times New Roman"/>
+          <w:lang w:val="sv-SE"/>
         </w:rPr>
       </w:pPr>
       <w:r>
         <w:rPr>
           <w:rFonts w:ascii="Times New Roman" w:hAnsi="Times New Roman" w:cs="Times New Roman"/>
+          <w:lang w:val="sv-SE"/>
         </w:rPr>
-        <w:t>2024</w:t>
+        <w:t>202</w:t>
+      </w:r>
+      <w:r>
+        <w:rPr>
+          <w:rFonts w:ascii="Times New Roman" w:hAnsi="Times New Roman" w:cs="Times New Roman"/>
+          <w:lang w:val="sv-SE"/>
+        </w:rPr>
+        <w:t>6</w:t>
+      </w:r>
+      <w:r>
+        <w:rPr>
+          <w:lang w:val="sv-SE"/>
+        </w:rPr>
+        <w:br w:type="page"/>
       </w:r>
     </w:p>
     <w:p>
-      <w:pPr>
-        <w:pStyle w:val="Heading1"/>
-        <w:rPr>
-          <w:rFonts w:ascii="Times New Roman" w:hAnsi="Times New Roman" w:cs="Times New Roman"/>
-          <w:color w:val="auto"/>
-        </w:rPr>
-      </w:pPr>
       <w:r>
         <w:rPr>
-          <w:rFonts w:ascii="Times New Roman" w:hAnsi="Times New Roman" w:cs="Times New Roman"/>
-          <w:color w:val="auto"/>
+          <w:rFonts w:ascii="Times New Roman" w:hAnsi="Times New Roman"/>
+          <w:b/>
+          <w:sz w:val="28"/>
         </w:rPr>
         <w:lastRenderedPageBreak/>
-        <w:t>Jobsheet 7</w:t>
+        <w:t>Jobsheet 13: Table Actions &amp; Custom Action di Filament</w:t>
       </w:r>
     </w:p>
     <w:p>
       <w:pPr>
-        <w:pStyle w:val="Heading3"/>
-        <w:numPr>
-          <w:ilvl w:val="0"/>
-          <w:numId w:val="36"/>
-        </w:numPr>
+        <w:jc w:val="both"/>
         <w:rPr>
-          <w:rFonts w:ascii="Times New Roman" w:hAnsi="Times New Roman" w:cs="Times New Roman"/>
-          <w:color w:val="auto"/>
+          <w:lang w:val="sv-SE"/>
         </w:rPr>
       </w:pPr>
       <w:r>
         <w:rPr>
-          <w:rFonts w:ascii="Times New Roman" w:hAnsi="Times New Roman" w:cs="Times New Roman"/>
-          <w:color w:val="auto"/>
+          <w:rFonts w:ascii="Times New Roman" w:hAnsi="Times New Roman"/>
+          <w:lang w:val="sv-SE"/>
         </w:rPr>
-        <w:t>Wizard Step 1 - Product Info</w:t>
+        <w:t>Pada praktikum ini, implementasi custom actions ditambahkan pada tabel Posts menggunakan Filament. Fitur ini memungkinkan pengguna untuk melakukan tindakan secara langsung pada baris data tabel, seperti Delete, Replicate, dan custom action untuk mengubah status publikasi secara cepat (Status Change).</w:t>
       </w:r>
     </w:p>
     <w:p>
       <w:pPr>
-        <w:rPr>
-          <w:rFonts w:ascii="Times New Roman" w:hAnsi="Times New Roman" w:cs="Times New Roman"/>
-        </w:rPr>
+        <w:jc w:val="center"/>
       </w:pPr>
       <w:r>
         <w:rPr>
-          <w:rFonts w:ascii="Times New Roman" w:hAnsi="Times New Roman" w:cs="Times New Roman"/>
           <w:noProof/>
         </w:rPr>
         <w:drawing>
-          <wp:anchor distT="0" distB="0" distL="114300" distR="114300" simplePos="0" relativeHeight="251660288" behindDoc="0" locked="0" layoutInCell="1" allowOverlap="1" wp14:anchorId="4FA565D2" wp14:editId="1A723A24">
-            <wp:simplePos x="0" y="0"/>
-            <wp:positionH relativeFrom="margin">
-              <wp:align>left</wp:align>
-            </wp:positionH>
-            <wp:positionV relativeFrom="paragraph">
-              <wp:posOffset>317500</wp:posOffset>
-            </wp:positionV>
-            <wp:extent cx="5995035" cy="4269740"/>
-            <wp:effectExtent l="0" t="0" r="5715" b="0"/>
-            <wp:wrapTopAndBottom/>
-            <wp:docPr id="1721838324" name="Picture 1"/>
+          <wp:inline distT="0" distB="0" distL="0" distR="0" wp14:anchorId="43E8CF7A" wp14:editId="556C5BFA">
+            <wp:extent cx="5486400" cy="3086100"/>
+            <wp:effectExtent l="0" t="0" r="0" b="0"/>
+            <wp:docPr id="403153761" name="Picture 403153761"/>
             <wp:cNvGraphicFramePr>
               <a:graphicFrameLocks xmlns:a="http://schemas.openxmlformats.org/drawingml/2006/main" noChangeAspect="1"/>
             </wp:cNvGraphicFramePr>
@@ -467,7 +460,7 @@
               <a:graphicData uri="http://schemas.openxmlformats.org/drawingml/2006/picture">
                 <pic:pic xmlns:pic="http://schemas.openxmlformats.org/drawingml/2006/picture">
                   <pic:nvPicPr>
-                    <pic:cNvPr id="1721838324" name=""/>
+                    <pic:cNvPr id="0" name="Screenshot_Jobsheet13_DeleteReplicateAction.png"/>
                     <pic:cNvPicPr/>
                   </pic:nvPicPr>
                   <pic:blipFill>
@@ -479,7 +472,7 @@
                   <pic:spPr>
                     <a:xfrm>
                       <a:off x="0" y="0"/>
-                      <a:ext cx="5995035" cy="4269740"/>
+                      <a:ext cx="5486400" cy="3086100"/>
                     </a:xfrm>
                     <a:prstGeom prst="rect">
                       <a:avLst/>
@@ -488,78 +481,36 @@
                 </pic:pic>
               </a:graphicData>
             </a:graphic>
-            <wp14:sizeRelH relativeFrom="margin">
-              <wp14:pctWidth>0</wp14:pctWidth>
-            </wp14:sizeRelH>
-            <wp14:sizeRelV relativeFrom="margin">
-              <wp14:pctHeight>0</wp14:pctHeight>
-            </wp14:sizeRelV>
-          </wp:anchor>
+          </wp:inline>
         </w:drawing>
-      </w:r>
-      <w:r>
-        <w:rPr>
-          <w:rFonts w:ascii="Times New Roman" w:hAnsi="Times New Roman" w:cs="Times New Roman"/>
-        </w:rPr>
-        <w:t xml:space="preserve">        </w:t>
       </w:r>
     </w:p>
     <w:p>
       <w:pPr>
-        <w:pStyle w:val="Heading3"/>
-        <w:numPr>
-          <w:ilvl w:val="0"/>
-          <w:numId w:val="36"/>
-        </w:numPr>
-        <w:tabs>
-          <w:tab w:val="center" w:pos="4680"/>
-        </w:tabs>
-        <w:rPr>
-          <w:rFonts w:ascii="Times New Roman" w:hAnsi="Times New Roman" w:cs="Times New Roman"/>
-          <w:color w:val="auto"/>
-        </w:rPr>
+        <w:jc w:val="center"/>
       </w:pPr>
       <w:r>
         <w:rPr>
-          <w:rFonts w:ascii="Times New Roman" w:hAnsi="Times New Roman" w:cs="Times New Roman"/>
-          <w:color w:val="auto"/>
+          <w:rFonts w:ascii="Times New Roman" w:hAnsi="Times New Roman"/>
+          <w:i/>
+          <w:sz w:val="20"/>
         </w:rPr>
-        <w:lastRenderedPageBreak/>
-        <w:t>Wizard Step 2 - Pricing &amp; Stock</w:t>
-      </w:r>
-      <w:r>
-        <w:rPr>
-          <w:rFonts w:ascii="Times New Roman" w:hAnsi="Times New Roman" w:cs="Times New Roman"/>
-          <w:color w:val="auto"/>
-        </w:rPr>
-        <w:tab/>
+        <w:t>Gambar: Action Default (Delete dan Replicate) pada tabel Posts</w:t>
       </w:r>
     </w:p>
     <w:p>
       <w:pPr>
-        <w:pStyle w:val="ListParagraph"/>
-        <w:rPr>
-          <w:rFonts w:ascii="Times New Roman" w:hAnsi="Times New Roman" w:cs="Times New Roman"/>
-        </w:rPr>
+        <w:jc w:val="center"/>
       </w:pPr>
       <w:r>
         <w:rPr>
-          <w:rFonts w:ascii="Times New Roman" w:hAnsi="Times New Roman" w:cs="Times New Roman"/>
           <w:noProof/>
         </w:rPr>
         <w:drawing>
-          <wp:anchor distT="0" distB="0" distL="114300" distR="114300" simplePos="0" relativeHeight="251662336" behindDoc="0" locked="0" layoutInCell="1" allowOverlap="1" wp14:anchorId="69558C43" wp14:editId="42081275">
-            <wp:simplePos x="0" y="0"/>
-            <wp:positionH relativeFrom="column">
-              <wp:posOffset>0</wp:posOffset>
-            </wp:positionH>
-            <wp:positionV relativeFrom="paragraph">
-              <wp:posOffset>222885</wp:posOffset>
-            </wp:positionV>
-            <wp:extent cx="5943600" cy="2910205"/>
-            <wp:effectExtent l="0" t="0" r="0" b="4445"/>
-            <wp:wrapTopAndBottom/>
-            <wp:docPr id="295276611" name="Picture 1"/>
+          <wp:inline distT="0" distB="0" distL="0" distR="0" wp14:anchorId="39116BCC" wp14:editId="6C61531D">
+            <wp:extent cx="5486400" cy="3086100"/>
+            <wp:effectExtent l="0" t="0" r="0" b="0"/>
+            <wp:docPr id="403153762" name="Picture 403153762"/>
             <wp:cNvGraphicFramePr>
               <a:graphicFrameLocks xmlns:a="http://schemas.openxmlformats.org/drawingml/2006/main" noChangeAspect="1"/>
             </wp:cNvGraphicFramePr>
@@ -567,7 +518,7 @@
               <a:graphicData uri="http://schemas.openxmlformats.org/drawingml/2006/picture">
                 <pic:pic xmlns:pic="http://schemas.openxmlformats.org/drawingml/2006/picture">
                   <pic:nvPicPr>
-                    <pic:cNvPr id="295276611" name=""/>
+                    <pic:cNvPr id="0" name="Screenshot_Jobsheet13_CustomStatusAction.png"/>
                     <pic:cNvPicPr/>
                   </pic:nvPicPr>
                   <pic:blipFill>
@@ -579,7 +530,7 @@
                   <pic:spPr>
                     <a:xfrm>
                       <a:off x="0" y="0"/>
-                      <a:ext cx="5943600" cy="2910205"/>
+                      <a:ext cx="5486400" cy="3086100"/>
                     </a:xfrm>
                     <a:prstGeom prst="rect">
                       <a:avLst/>
@@ -588,45 +539,58 @@
                 </pic:pic>
               </a:graphicData>
             </a:graphic>
-          </wp:anchor>
+          </wp:inline>
         </w:drawing>
       </w:r>
     </w:p>
     <w:p>
       <w:pPr>
-        <w:pStyle w:val="ListParagraph"/>
+        <w:jc w:val="center"/>
+      </w:pPr>
+      <w:r>
         <w:rPr>
-          <w:rFonts w:ascii="Times New Roman" w:hAnsi="Times New Roman" w:cs="Times New Roman"/>
+          <w:rFonts w:ascii="Times New Roman" w:hAnsi="Times New Roman"/>
+          <w:i/>
+          <w:sz w:val="20"/>
         </w:rPr>
-      </w:pPr>
+        <w:t>Gambar: Dialog Custom Action untuk mengubah status Published</w:t>
+      </w:r>
     </w:p>
     <w:p>
-      <w:pPr>
-        <w:pStyle w:val="Heading3"/>
-        <w:rPr>
-          <w:rFonts w:ascii="Times New Roman" w:hAnsi="Times New Roman" w:cs="Times New Roman"/>
-          <w:color w:val="auto"/>
-        </w:rPr>
-      </w:pPr>
       <w:r>
         <w:rPr>
-          <w:rFonts w:ascii="Times New Roman" w:hAnsi="Times New Roman" w:cs="Times New Roman"/>
+          <w:rFonts w:ascii="Times New Roman" w:hAnsi="Times New Roman"/>
+          <w:b/>
+          <w:sz w:val="28"/>
+        </w:rPr>
+        <w:lastRenderedPageBreak/>
+        <w:t>Jobsheet 14: Implementasi Relationship HasMany pada Filament</w:t>
+      </w:r>
+    </w:p>
+    <w:p>
+      <w:pPr>
+        <w:jc w:val="both"/>
+      </w:pPr>
+      <w:r>
+        <w:rPr>
+          <w:rFonts w:ascii="Times New Roman" w:hAnsi="Times New Roman"/>
+        </w:rPr>
+        <w:t>Jobsheet ini berfokus pada implementasi relasi HasMany dan BelongsTo di Filament. Relasi digunakan untuk menghubungkan Category dengan Posts. Fitur yang ditambahkan meliputi Relationship Dropdown yang dapat dicari pada form post, menampilkan kolom kategori di tabel post, serta menggunakan Relationship Manager untuk mengatur posts dari dalam form kategori.</w:t>
+      </w:r>
+    </w:p>
+    <w:p>
+      <w:pPr>
+        <w:jc w:val="center"/>
+      </w:pPr>
+      <w:r>
+        <w:rPr>
           <w:noProof/>
-          <w:color w:val="auto"/>
         </w:rPr>
         <w:drawing>
-          <wp:anchor distT="0" distB="0" distL="114300" distR="114300" simplePos="0" relativeHeight="251664384" behindDoc="0" locked="0" layoutInCell="1" allowOverlap="1" wp14:anchorId="4C5E701A" wp14:editId="06656F0A">
-            <wp:simplePos x="0" y="0"/>
-            <wp:positionH relativeFrom="margin">
-              <wp:align>right</wp:align>
-            </wp:positionH>
-            <wp:positionV relativeFrom="paragraph">
-              <wp:posOffset>396240</wp:posOffset>
-            </wp:positionV>
-            <wp:extent cx="5943600" cy="3752850"/>
+          <wp:inline distT="0" distB="0" distL="0" distR="0" wp14:anchorId="6CBE6FDA" wp14:editId="60D5E2D3">
+            <wp:extent cx="5486400" cy="3086100"/>
             <wp:effectExtent l="0" t="0" r="0" b="0"/>
-            <wp:wrapTopAndBottom/>
-            <wp:docPr id="469522043" name="Picture 1"/>
+            <wp:docPr id="403153763" name="Picture 403153763"/>
             <wp:cNvGraphicFramePr>
               <a:graphicFrameLocks xmlns:a="http://schemas.openxmlformats.org/drawingml/2006/main" noChangeAspect="1"/>
             </wp:cNvGraphicFramePr>
@@ -634,7 +598,7 @@
               <a:graphicData uri="http://schemas.openxmlformats.org/drawingml/2006/picture">
                 <pic:pic xmlns:pic="http://schemas.openxmlformats.org/drawingml/2006/picture">
                   <pic:nvPicPr>
-                    <pic:cNvPr id="469522043" name=""/>
+                    <pic:cNvPr id="0" name="Screenshot_Jobsheet14_DropdownKategori.png"/>
                     <pic:cNvPicPr/>
                   </pic:nvPicPr>
                   <pic:blipFill>
@@ -646,7 +610,7 @@
                   <pic:spPr>
                     <a:xfrm>
                       <a:off x="0" y="0"/>
-                      <a:ext cx="5943600" cy="3752850"/>
+                      <a:ext cx="5486400" cy="3086100"/>
                     </a:xfrm>
                     <a:prstGeom prst="rect">
                       <a:avLst/>
@@ -655,68 +619,36 @@
                 </pic:pic>
               </a:graphicData>
             </a:graphic>
-            <wp14:sizeRelV relativeFrom="margin">
-              <wp14:pctHeight>0</wp14:pctHeight>
-            </wp14:sizeRelV>
-          </wp:anchor>
+          </wp:inline>
         </w:drawing>
-      </w:r>
-      <w:r>
-        <w:rPr>
-          <w:rFonts w:ascii="Times New Roman" w:hAnsi="Times New Roman" w:cs="Times New Roman"/>
-          <w:color w:val="auto"/>
-        </w:rPr>
-        <w:t>3. Wizard Step 3 - Media &amp; Status</w:t>
       </w:r>
     </w:p>
     <w:p>
       <w:pPr>
-        <w:rPr>
-          <w:rFonts w:ascii="Times New Roman" w:hAnsi="Times New Roman" w:cs="Times New Roman"/>
-        </w:rPr>
-      </w:pPr>
-    </w:p>
-    <w:p>
-      <w:pPr>
-        <w:pStyle w:val="Heading3"/>
-        <w:rPr>
-          <w:rFonts w:ascii="Times New Roman" w:hAnsi="Times New Roman" w:cs="Times New Roman"/>
-          <w:color w:val="auto"/>
-        </w:rPr>
+        <w:jc w:val="center"/>
       </w:pPr>
       <w:r>
         <w:rPr>
-          <w:rFonts w:ascii="Times New Roman" w:hAnsi="Times New Roman" w:cs="Times New Roman"/>
-          <w:color w:val="auto"/>
+          <w:rFonts w:ascii="Times New Roman" w:hAnsi="Times New Roman"/>
+          <w:i/>
+          <w:sz w:val="20"/>
         </w:rPr>
-        <w:lastRenderedPageBreak/>
-        <w:t>4. Tabel Product</w:t>
+        <w:t>Gambar: Dropdown Category (Select component) pada form Post</w:t>
       </w:r>
     </w:p>
     <w:p>
       <w:pPr>
-        <w:rPr>
-          <w:rFonts w:ascii="Times New Roman" w:hAnsi="Times New Roman" w:cs="Times New Roman"/>
-        </w:rPr>
+        <w:jc w:val="center"/>
       </w:pPr>
       <w:r>
         <w:rPr>
-          <w:rFonts w:ascii="Times New Roman" w:hAnsi="Times New Roman" w:cs="Times New Roman"/>
           <w:noProof/>
         </w:rPr>
         <w:drawing>
-          <wp:anchor distT="0" distB="0" distL="114300" distR="114300" simplePos="0" relativeHeight="251666432" behindDoc="0" locked="0" layoutInCell="1" allowOverlap="1" wp14:anchorId="1EF59B44" wp14:editId="4F524D8E">
-            <wp:simplePos x="0" y="0"/>
-            <wp:positionH relativeFrom="column">
-              <wp:posOffset>0</wp:posOffset>
-            </wp:positionH>
-            <wp:positionV relativeFrom="paragraph">
-              <wp:posOffset>318135</wp:posOffset>
-            </wp:positionV>
-            <wp:extent cx="5943600" cy="2263140"/>
-            <wp:effectExtent l="0" t="0" r="0" b="3810"/>
-            <wp:wrapTopAndBottom/>
-            <wp:docPr id="793594647" name="Picture 1"/>
+          <wp:inline distT="0" distB="0" distL="0" distR="0" wp14:anchorId="086B9066" wp14:editId="218F4112">
+            <wp:extent cx="5486400" cy="3086100"/>
+            <wp:effectExtent l="0" t="0" r="0" b="0"/>
+            <wp:docPr id="403153764" name="Picture 403153764"/>
             <wp:cNvGraphicFramePr>
               <a:graphicFrameLocks xmlns:a="http://schemas.openxmlformats.org/drawingml/2006/main" noChangeAspect="1"/>
             </wp:cNvGraphicFramePr>
@@ -724,7 +656,70 @@
               <a:graphicData uri="http://schemas.openxmlformats.org/drawingml/2006/picture">
                 <pic:pic xmlns:pic="http://schemas.openxmlformats.org/drawingml/2006/picture">
                   <pic:nvPicPr>
-                    <pic:cNvPr id="793594647" name=""/>
+                    <pic:cNvPr id="0" name="Screenshot_Jobsheet13_DeleteReplicateAction.png"/>
+                    <pic:cNvPicPr/>
+                  </pic:nvPicPr>
+                  <pic:blipFill>
+                    <a:blip r:embed="rId6"/>
+                    <a:stretch>
+                      <a:fillRect/>
+                    </a:stretch>
+                  </pic:blipFill>
+                  <pic:spPr>
+                    <a:xfrm>
+                      <a:off x="0" y="0"/>
+                      <a:ext cx="5486400" cy="3086100"/>
+                    </a:xfrm>
+                    <a:prstGeom prst="rect">
+                      <a:avLst/>
+                    </a:prstGeom>
+                  </pic:spPr>
+                </pic:pic>
+              </a:graphicData>
+            </a:graphic>
+          </wp:inline>
+        </w:drawing>
+      </w:r>
+    </w:p>
+    <w:p>
+      <w:pPr>
+        <w:jc w:val="center"/>
+        <w:rPr>
+          <w:lang w:val="sv-SE"/>
+        </w:rPr>
+      </w:pPr>
+      <w:r>
+        <w:rPr>
+          <w:rFonts w:ascii="Times New Roman" w:hAnsi="Times New Roman"/>
+          <w:i/>
+          <w:sz w:val="20"/>
+          <w:lang w:val="sv-SE"/>
+        </w:rPr>
+        <w:t>Gambar: Tabel Post menampilkan relasi Kategori</w:t>
+      </w:r>
+    </w:p>
+    <w:p>
+      <w:pPr>
+        <w:jc w:val="center"/>
+      </w:pPr>
+      <w:r>
+        <w:rPr>
+          <w:noProof/>
+        </w:rPr>
+        <w:lastRenderedPageBreak/>
+        <w:drawing>
+          <wp:inline distT="0" distB="0" distL="0" distR="0" wp14:anchorId="0FC002DE" wp14:editId="543AC262">
+            <wp:extent cx="5486400" cy="3086100"/>
+            <wp:effectExtent l="0" t="0" r="0" b="0"/>
+            <wp:docPr id="403153765" name="Picture 403153765"/>
+            <wp:cNvGraphicFramePr>
+              <a:graphicFrameLocks xmlns:a="http://schemas.openxmlformats.org/drawingml/2006/main" noChangeAspect="1"/>
+            </wp:cNvGraphicFramePr>
+            <a:graphic xmlns:a="http://schemas.openxmlformats.org/drawingml/2006/main">
+              <a:graphicData uri="http://schemas.openxmlformats.org/drawingml/2006/picture">
+                <pic:pic xmlns:pic="http://schemas.openxmlformats.org/drawingml/2006/picture">
+                  <pic:nvPicPr>
+                    <pic:cNvPr id="0" name="Screenshot_Jobsheet14_RelationshipManagerCategory.png"/>
                     <pic:cNvPicPr/>
                   </pic:nvPicPr>
                   <pic:blipFill>
@@ -736,7 +731,7 @@
                   <pic:spPr>
                     <a:xfrm>
                       <a:off x="0" y="0"/>
-                      <a:ext cx="5943600" cy="2263140"/>
+                      <a:ext cx="5486400" cy="3086100"/>
                     </a:xfrm>
                     <a:prstGeom prst="rect">
                       <a:avLst/>
@@ -745,67 +740,61 @@
                 </pic:pic>
               </a:graphicData>
             </a:graphic>
-          </wp:anchor>
+          </wp:inline>
         </w:drawing>
       </w:r>
     </w:p>
     <w:p>
       <w:pPr>
-        <w:rPr>
-          <w:rFonts w:ascii="Times New Roman" w:hAnsi="Times New Roman" w:cs="Times New Roman"/>
-        </w:rPr>
+        <w:jc w:val="center"/>
       </w:pPr>
       <w:r>
         <w:rPr>
-          <w:rFonts w:ascii="Times New Roman" w:hAnsi="Times New Roman" w:cs="Times New Roman"/>
+          <w:rFonts w:ascii="Times New Roman" w:hAnsi="Times New Roman"/>
+          <w:i/>
+          <w:sz w:val="20"/>
         </w:rPr>
-        <w:br w:type="page"/>
+        <w:t>Gambar: Relationship Manager Posts pada edit Category</w:t>
       </w:r>
     </w:p>
     <w:p>
-      <w:pPr>
-        <w:pStyle w:val="Heading1"/>
-        <w:rPr>
-          <w:rFonts w:ascii="Times New Roman" w:hAnsi="Times New Roman" w:cs="Times New Roman"/>
-          <w:color w:val="auto"/>
-        </w:rPr>
-      </w:pPr>
       <w:r>
         <w:rPr>
-          <w:rFonts w:ascii="Times New Roman" w:hAnsi="Times New Roman" w:cs="Times New Roman"/>
-          <w:color w:val="auto"/>
+          <w:rFonts w:ascii="Times New Roman" w:hAnsi="Times New Roman"/>
+          <w:b/>
+          <w:sz w:val="28"/>
         </w:rPr>
-        <w:lastRenderedPageBreak/>
-        <w:t>Jobsheet 8</w:t>
+        <w:t>Jobsheet 15: Implementasi Many-to-Many Relationship pada Filament</w:t>
       </w:r>
     </w:p>
     <w:p>
       <w:pPr>
-        <w:pStyle w:val="Heading3"/>
+        <w:jc w:val="both"/>
         <w:rPr>
-          <w:rFonts w:ascii="Times New Roman" w:hAnsi="Times New Roman" w:cs="Times New Roman"/>
-          <w:color w:val="auto"/>
+          <w:lang w:val="sv-SE"/>
         </w:rPr>
       </w:pPr>
       <w:r>
         <w:rPr>
-          <w:rFonts w:ascii="Times New Roman" w:hAnsi="Times New Roman" w:cs="Times New Roman"/>
+          <w:rFonts w:ascii="Times New Roman" w:hAnsi="Times New Roman"/>
+          <w:lang w:val="sv-SE"/>
+        </w:rPr>
+        <w:t>Praktikum ini membahas relasi Many-to-Many antara Post dan Tag. Tabel pivot 'post_tag' digunakan untuk menghubungkannya. Selain itu, Multiple Select component digunakan untuk mengisi tags pada form Post dan Relationship Manager digunakan agar tags juga dapat diatur secara langsung (Attach/Detach).</w:t>
+      </w:r>
+    </w:p>
+    <w:p>
+      <w:pPr>
+        <w:jc w:val="center"/>
+      </w:pPr>
+      <w:r>
+        <w:rPr>
           <w:noProof/>
-          <w:color w:val="auto"/>
         </w:rPr>
         <w:drawing>
-          <wp:anchor distT="0" distB="0" distL="114300" distR="114300" simplePos="0" relativeHeight="251668480" behindDoc="0" locked="0" layoutInCell="1" allowOverlap="1" wp14:anchorId="71DFB2A5" wp14:editId="5B338866">
-            <wp:simplePos x="0" y="0"/>
-            <wp:positionH relativeFrom="column">
-              <wp:posOffset>20955</wp:posOffset>
-            </wp:positionH>
-            <wp:positionV relativeFrom="paragraph">
-              <wp:posOffset>386715</wp:posOffset>
-            </wp:positionV>
-            <wp:extent cx="5943600" cy="3689350"/>
-            <wp:effectExtent l="0" t="0" r="0" b="6350"/>
-            <wp:wrapTopAndBottom/>
-            <wp:docPr id="25822236" name="Picture 1"/>
+          <wp:inline distT="0" distB="0" distL="0" distR="0" wp14:anchorId="6D400B3B" wp14:editId="4CFBCA46">
+            <wp:extent cx="5486400" cy="3086100"/>
+            <wp:effectExtent l="0" t="0" r="0" b="0"/>
+            <wp:docPr id="403153766" name="Picture 403153766"/>
             <wp:cNvGraphicFramePr>
               <a:graphicFrameLocks xmlns:a="http://schemas.openxmlformats.org/drawingml/2006/main" noChangeAspect="1"/>
             </wp:cNvGraphicFramePr>
@@ -813,7 +802,7 @@
               <a:graphicData uri="http://schemas.openxmlformats.org/drawingml/2006/picture">
                 <pic:pic xmlns:pic="http://schemas.openxmlformats.org/drawingml/2006/picture">
                   <pic:nvPicPr>
-                    <pic:cNvPr id="25822236" name=""/>
+                    <pic:cNvPr id="0" name="Screenshot_Jobsheet15_HalamanTagResource.png"/>
                     <pic:cNvPicPr/>
                   </pic:nvPicPr>
                   <pic:blipFill>
@@ -825,7 +814,7 @@
                   <pic:spPr>
                     <a:xfrm>
                       <a:off x="0" y="0"/>
-                      <a:ext cx="5943600" cy="3689350"/>
+                      <a:ext cx="5486400" cy="3086100"/>
                     </a:xfrm>
                     <a:prstGeom prst="rect">
                       <a:avLst/>
@@ -834,68 +823,37 @@
                 </pic:pic>
               </a:graphicData>
             </a:graphic>
-            <wp14:sizeRelV relativeFrom="margin">
-              <wp14:pctHeight>0</wp14:pctHeight>
-            </wp14:sizeRelV>
-          </wp:anchor>
+          </wp:inline>
         </w:drawing>
-      </w:r>
-      <w:r>
-        <w:rPr>
-          <w:rFonts w:ascii="Times New Roman" w:hAnsi="Times New Roman" w:cs="Times New Roman"/>
-          <w:color w:val="auto"/>
-        </w:rPr>
-        <w:t>1. Section Product Info</w:t>
       </w:r>
     </w:p>
     <w:p>
       <w:pPr>
-        <w:rPr>
-          <w:rFonts w:ascii="Times New Roman" w:hAnsi="Times New Roman" w:cs="Times New Roman"/>
-        </w:rPr>
-      </w:pPr>
-    </w:p>
-    <w:p>
-      <w:pPr>
-        <w:pStyle w:val="Heading3"/>
-        <w:rPr>
-          <w:rFonts w:ascii="Times New Roman" w:hAnsi="Times New Roman" w:cs="Times New Roman"/>
-          <w:color w:val="auto"/>
-        </w:rPr>
+        <w:jc w:val="center"/>
       </w:pPr>
       <w:r>
         <w:rPr>
-          <w:rFonts w:ascii="Times New Roman" w:hAnsi="Times New Roman" w:cs="Times New Roman"/>
-          <w:color w:val="auto"/>
+          <w:rFonts w:ascii="Times New Roman" w:hAnsi="Times New Roman"/>
+          <w:i/>
+          <w:sz w:val="20"/>
         </w:rPr>
-        <w:lastRenderedPageBreak/>
-        <w:t>2. Section Pricing &amp; Stock</w:t>
+        <w:t>Gambar: Resource List halaman Tags</w:t>
       </w:r>
     </w:p>
     <w:p>
       <w:pPr>
-        <w:rPr>
-          <w:rFonts w:ascii="Times New Roman" w:hAnsi="Times New Roman" w:cs="Times New Roman"/>
-        </w:rPr>
+        <w:jc w:val="center"/>
       </w:pPr>
       <w:r>
         <w:rPr>
-          <w:rFonts w:ascii="Times New Roman" w:hAnsi="Times New Roman" w:cs="Times New Roman"/>
           <w:noProof/>
         </w:rPr>
+        <w:lastRenderedPageBreak/>
         <w:drawing>
-          <wp:anchor distT="0" distB="0" distL="114300" distR="114300" simplePos="0" relativeHeight="251670528" behindDoc="0" locked="0" layoutInCell="1" allowOverlap="1" wp14:anchorId="1F8C5DEA" wp14:editId="38F2D377">
-            <wp:simplePos x="0" y="0"/>
-            <wp:positionH relativeFrom="margin">
-              <wp:align>right</wp:align>
-            </wp:positionH>
-            <wp:positionV relativeFrom="paragraph">
-              <wp:posOffset>138016</wp:posOffset>
-            </wp:positionV>
-            <wp:extent cx="5943600" cy="3235325"/>
-            <wp:effectExtent l="0" t="0" r="0" b="3175"/>
-            <wp:wrapTopAndBottom/>
-            <wp:docPr id="863308107" name="Picture 1"/>
+          <wp:inline distT="0" distB="0" distL="0" distR="0" wp14:anchorId="728BB25F" wp14:editId="7446E9A2">
+            <wp:extent cx="5486400" cy="3086100"/>
+            <wp:effectExtent l="0" t="0" r="0" b="0"/>
+            <wp:docPr id="403153767" name="Picture 403153767"/>
             <wp:cNvGraphicFramePr>
               <a:graphicFrameLocks xmlns:a="http://schemas.openxmlformats.org/drawingml/2006/main" noChangeAspect="1"/>
             </wp:cNvGraphicFramePr>
@@ -903,7 +861,65 @@
               <a:graphicData uri="http://schemas.openxmlformats.org/drawingml/2006/picture">
                 <pic:pic xmlns:pic="http://schemas.openxmlformats.org/drawingml/2006/picture">
                   <pic:nvPicPr>
-                    <pic:cNvPr id="863308107" name=""/>
+                    <pic:cNvPr id="0" name="Screenshot_Jobsheet14_DropdownKategori.png"/>
+                    <pic:cNvPicPr/>
+                  </pic:nvPicPr>
+                  <pic:blipFill>
+                    <a:blip r:embed="rId8"/>
+                    <a:stretch>
+                      <a:fillRect/>
+                    </a:stretch>
+                  </pic:blipFill>
+                  <pic:spPr>
+                    <a:xfrm>
+                      <a:off x="0" y="0"/>
+                      <a:ext cx="5486400" cy="3086100"/>
+                    </a:xfrm>
+                    <a:prstGeom prst="rect">
+                      <a:avLst/>
+                    </a:prstGeom>
+                  </pic:spPr>
+                </pic:pic>
+              </a:graphicData>
+            </a:graphic>
+          </wp:inline>
+        </w:drawing>
+      </w:r>
+    </w:p>
+    <w:p>
+      <w:pPr>
+        <w:jc w:val="center"/>
+      </w:pPr>
+      <w:r>
+        <w:rPr>
+          <w:rFonts w:ascii="Times New Roman" w:hAnsi="Times New Roman"/>
+          <w:i/>
+          <w:sz w:val="20"/>
+        </w:rPr>
+        <w:t>Gambar: Form input multiple select Tags pada Edit Post</w:t>
+      </w:r>
+    </w:p>
+    <w:p>
+      <w:pPr>
+        <w:jc w:val="center"/>
+      </w:pPr>
+      <w:r>
+        <w:rPr>
+          <w:noProof/>
+        </w:rPr>
+        <w:drawing>
+          <wp:inline distT="0" distB="0" distL="0" distR="0" wp14:anchorId="5F7DE742" wp14:editId="7C1DAF1B">
+            <wp:extent cx="5486400" cy="3086100"/>
+            <wp:effectExtent l="0" t="0" r="0" b="0"/>
+            <wp:docPr id="403153768" name="Picture 403153768"/>
+            <wp:cNvGraphicFramePr>
+              <a:graphicFrameLocks xmlns:a="http://schemas.openxmlformats.org/drawingml/2006/main" noChangeAspect="1"/>
+            </wp:cNvGraphicFramePr>
+            <a:graphic xmlns:a="http://schemas.openxmlformats.org/drawingml/2006/main">
+              <a:graphicData uri="http://schemas.openxmlformats.org/drawingml/2006/picture">
+                <pic:pic xmlns:pic="http://schemas.openxmlformats.org/drawingml/2006/picture">
+                  <pic:nvPicPr>
+                    <pic:cNvPr id="0" name="Screenshot_Jobsheet15_RelationshipManagerTags.png"/>
                     <pic:cNvPicPr/>
                   </pic:nvPicPr>
                   <pic:blipFill>
@@ -915,7 +931,7 @@
                   <pic:spPr>
                     <a:xfrm>
                       <a:off x="0" y="0"/>
-                      <a:ext cx="5943600" cy="3235325"/>
+                      <a:ext cx="5486400" cy="3086100"/>
                     </a:xfrm>
                     <a:prstGeom prst="rect">
                       <a:avLst/>
@@ -924,254 +940,22 @@
                 </pic:pic>
               </a:graphicData>
             </a:graphic>
-          </wp:anchor>
+          </wp:inline>
         </w:drawing>
       </w:r>
     </w:p>
     <w:p>
       <w:pPr>
-        <w:pStyle w:val="Heading3"/>
-        <w:rPr>
-          <w:rFonts w:ascii="Times New Roman" w:hAnsi="Times New Roman" w:cs="Times New Roman"/>
-          <w:color w:val="auto"/>
-        </w:rPr>
+        <w:jc w:val="center"/>
       </w:pPr>
       <w:r>
         <w:rPr>
-          <w:rFonts w:ascii="Times New Roman" w:hAnsi="Times New Roman" w:cs="Times New Roman"/>
-          <w:noProof/>
-          <w:color w:val="auto"/>
+          <w:rFonts w:ascii="Times New Roman" w:hAnsi="Times New Roman"/>
+          <w:i/>
+          <w:sz w:val="20"/>
         </w:rPr>
-        <w:drawing>
-          <wp:anchor distT="0" distB="0" distL="114300" distR="114300" simplePos="0" relativeHeight="251672576" behindDoc="0" locked="0" layoutInCell="1" allowOverlap="1" wp14:anchorId="14EC874E" wp14:editId="73090EB0">
-            <wp:simplePos x="0" y="0"/>
-            <wp:positionH relativeFrom="margin">
-              <wp:align>right</wp:align>
-            </wp:positionH>
-            <wp:positionV relativeFrom="paragraph">
-              <wp:posOffset>288925</wp:posOffset>
-            </wp:positionV>
-            <wp:extent cx="5942965" cy="3678555"/>
-            <wp:effectExtent l="0" t="0" r="635" b="0"/>
-            <wp:wrapTopAndBottom/>
-            <wp:docPr id="560755052" name="Picture 1"/>
-            <wp:cNvGraphicFramePr>
-              <a:graphicFrameLocks xmlns:a="http://schemas.openxmlformats.org/drawingml/2006/main" noChangeAspect="1"/>
-            </wp:cNvGraphicFramePr>
-            <a:graphic xmlns:a="http://schemas.openxmlformats.org/drawingml/2006/main">
-              <a:graphicData uri="http://schemas.openxmlformats.org/drawingml/2006/picture">
-                <pic:pic xmlns:pic="http://schemas.openxmlformats.org/drawingml/2006/picture">
-                  <pic:nvPicPr>
-                    <pic:cNvPr id="560755052" name=""/>
-                    <pic:cNvPicPr/>
-                  </pic:nvPicPr>
-                  <pic:blipFill>
-                    <a:blip r:embed="rId12"/>
-                    <a:stretch>
-                      <a:fillRect/>
-                    </a:stretch>
-                  </pic:blipFill>
-                  <pic:spPr>
-                    <a:xfrm>
-                      <a:off x="0" y="0"/>
-                      <a:ext cx="5942965" cy="3678555"/>
-                    </a:xfrm>
-                    <a:prstGeom prst="rect">
-                      <a:avLst/>
-                    </a:prstGeom>
-                  </pic:spPr>
-                </pic:pic>
-              </a:graphicData>
-            </a:graphic>
-            <wp14:sizeRelV relativeFrom="margin">
-              <wp14:pctHeight>0</wp14:pctHeight>
-            </wp14:sizeRelV>
-          </wp:anchor>
-        </w:drawing>
+        <w:t>Gambar: Tags Relationship Manager pada halaman Edit Post</w:t>
       </w:r>
-      <w:r>
-        <w:rPr>
-          <w:rFonts w:ascii="Times New Roman" w:hAnsi="Times New Roman" w:cs="Times New Roman"/>
-          <w:color w:val="auto"/>
-        </w:rPr>
-        <w:t>3. Section Media &amp; Status</w:t>
-      </w:r>
-    </w:p>
-    <w:p>
-      <w:pPr>
-        <w:tabs>
-          <w:tab w:val="left" w:pos="3885"/>
-        </w:tabs>
-        <w:rPr>
-          <w:rFonts w:ascii="Times New Roman" w:hAnsi="Times New Roman" w:cs="Times New Roman"/>
-        </w:rPr>
-      </w:pPr>
-      <w:r>
-        <w:rPr>
-          <w:rFonts w:ascii="Times New Roman" w:hAnsi="Times New Roman" w:cs="Times New Roman"/>
-        </w:rPr>
-        <w:tab/>
-      </w:r>
-    </w:p>
-    <w:p>
-      <w:pPr>
-        <w:pStyle w:val="Heading1"/>
-        <w:rPr>
-          <w:rFonts w:ascii="Times New Roman" w:hAnsi="Times New Roman" w:cs="Times New Roman"/>
-          <w:color w:val="auto"/>
-        </w:rPr>
-      </w:pPr>
-      <w:r>
-        <w:rPr>
-          <w:rFonts w:ascii="Times New Roman" w:hAnsi="Times New Roman" w:cs="Times New Roman"/>
-          <w:color w:val="auto"/>
-        </w:rPr>
-        <w:lastRenderedPageBreak/>
-        <w:t>Jobsheet 9</w:t>
-      </w:r>
-    </w:p>
-    <w:p>
-      <w:pPr>
-        <w:pStyle w:val="Heading3"/>
-        <w:rPr>
-          <w:rFonts w:ascii="Times New Roman" w:hAnsi="Times New Roman" w:cs="Times New Roman"/>
-          <w:color w:val="auto"/>
-        </w:rPr>
-      </w:pPr>
-      <w:r>
-        <w:rPr>
-          <w:rFonts w:ascii="Times New Roman" w:hAnsi="Times New Roman" w:cs="Times New Roman"/>
-          <w:color w:val="auto"/>
-        </w:rPr>
-        <w:t>1. Tab Vertical &amp; Badge Dinamis</w:t>
-      </w:r>
-    </w:p>
-    <w:p>
-      <w:pPr>
-        <w:rPr>
-          <w:rFonts w:ascii="Times New Roman" w:hAnsi="Times New Roman" w:cs="Times New Roman"/>
-        </w:rPr>
-      </w:pPr>
-      <w:r>
-        <w:rPr>
-          <w:rFonts w:ascii="Times New Roman" w:hAnsi="Times New Roman" w:cs="Times New Roman"/>
-        </w:rPr>
-        <w:drawing>
-          <wp:anchor distT="0" distB="0" distL="114300" distR="114300" simplePos="0" relativeHeight="251674624" behindDoc="0" locked="0" layoutInCell="1" allowOverlap="1" wp14:anchorId="75F8D0A8" wp14:editId="5E5AF4AB">
-            <wp:simplePos x="0" y="0"/>
-            <wp:positionH relativeFrom="margin">
-              <wp:align>right</wp:align>
-            </wp:positionH>
-            <wp:positionV relativeFrom="paragraph">
-              <wp:posOffset>66040</wp:posOffset>
-            </wp:positionV>
-            <wp:extent cx="5943600" cy="1822450"/>
-            <wp:effectExtent l="0" t="0" r="0" b="6350"/>
-            <wp:wrapTopAndBottom/>
-            <wp:docPr id="590107149" name="Picture 1"/>
-            <wp:cNvGraphicFramePr>
-              <a:graphicFrameLocks xmlns:a="http://schemas.openxmlformats.org/drawingml/2006/main" noChangeAspect="1"/>
-            </wp:cNvGraphicFramePr>
-            <a:graphic xmlns:a="http://schemas.openxmlformats.org/drawingml/2006/main">
-              <a:graphicData uri="http://schemas.openxmlformats.org/drawingml/2006/picture">
-                <pic:pic xmlns:pic="http://schemas.openxmlformats.org/drawingml/2006/picture">
-                  <pic:nvPicPr>
-                    <pic:cNvPr id="590107149" name=""/>
-                    <pic:cNvPicPr/>
-                  </pic:nvPicPr>
-                  <pic:blipFill>
-                    <a:blip r:embed="rId13"/>
-                    <a:stretch>
-                      <a:fillRect/>
-                    </a:stretch>
-                  </pic:blipFill>
-                  <pic:spPr>
-                    <a:xfrm>
-                      <a:off x="0" y="0"/>
-                      <a:ext cx="5943600" cy="1822450"/>
-                    </a:xfrm>
-                    <a:prstGeom prst="rect">
-                      <a:avLst/>
-                    </a:prstGeom>
-                  </pic:spPr>
-                </pic:pic>
-              </a:graphicData>
-            </a:graphic>
-          </wp:anchor>
-        </w:drawing>
-      </w:r>
-    </w:p>
-    <w:p>
-      <w:pPr>
-        <w:pStyle w:val="Heading3"/>
-        <w:rPr>
-          <w:rFonts w:ascii="Times New Roman" w:hAnsi="Times New Roman" w:cs="Times New Roman"/>
-          <w:color w:val="auto"/>
-        </w:rPr>
-      </w:pPr>
-      <w:r>
-        <w:rPr>
-          <w:rFonts w:ascii="Times New Roman" w:hAnsi="Times New Roman" w:cs="Times New Roman"/>
-          <w:color w:val="auto"/>
-        </w:rPr>
-        <w:drawing>
-          <wp:anchor distT="0" distB="0" distL="114300" distR="114300" simplePos="0" relativeHeight="251676672" behindDoc="0" locked="0" layoutInCell="1" allowOverlap="1" wp14:anchorId="5B42E022" wp14:editId="3F0C4D15">
-            <wp:simplePos x="0" y="0"/>
-            <wp:positionH relativeFrom="margin">
-              <wp:align>right</wp:align>
-            </wp:positionH>
-            <wp:positionV relativeFrom="paragraph">
-              <wp:posOffset>277495</wp:posOffset>
-            </wp:positionV>
-            <wp:extent cx="5943600" cy="1920240"/>
-            <wp:effectExtent l="0" t="0" r="0" b="3810"/>
-            <wp:wrapTopAndBottom/>
-            <wp:docPr id="1736096334" name="Picture 1"/>
-            <wp:cNvGraphicFramePr>
-              <a:graphicFrameLocks xmlns:a="http://schemas.openxmlformats.org/drawingml/2006/main" noChangeAspect="1"/>
-            </wp:cNvGraphicFramePr>
-            <a:graphic xmlns:a="http://schemas.openxmlformats.org/drawingml/2006/main">
-              <a:graphicData uri="http://schemas.openxmlformats.org/drawingml/2006/picture">
-                <pic:pic xmlns:pic="http://schemas.openxmlformats.org/drawingml/2006/picture">
-                  <pic:nvPicPr>
-                    <pic:cNvPr id="1736096334" name=""/>
-                    <pic:cNvPicPr/>
-                  </pic:nvPicPr>
-                  <pic:blipFill>
-                    <a:blip r:embed="rId14"/>
-                    <a:stretch>
-                      <a:fillRect/>
-                    </a:stretch>
-                  </pic:blipFill>
-                  <pic:spPr>
-                    <a:xfrm>
-                      <a:off x="0" y="0"/>
-                      <a:ext cx="5943600" cy="1920240"/>
-                    </a:xfrm>
-                    <a:prstGeom prst="rect">
-                      <a:avLst/>
-                    </a:prstGeom>
-                  </pic:spPr>
-                </pic:pic>
-              </a:graphicData>
-            </a:graphic>
-          </wp:anchor>
-        </w:drawing>
-      </w:r>
-      <w:r>
-        <w:rPr>
-          <w:rFonts w:ascii="Times New Roman" w:hAnsi="Times New Roman" w:cs="Times New Roman"/>
-          <w:color w:val="auto"/>
-        </w:rPr>
-        <w:t>2. Tab Horizontal</w:t>
-      </w:r>
-    </w:p>
-    <w:p>
-      <w:pPr>
-        <w:rPr>
-          <w:rFonts w:ascii="Times New Roman" w:hAnsi="Times New Roman" w:cs="Times New Roman"/>
-        </w:rPr>
-      </w:pPr>
     </w:p>
     <w:sectPr>
       <w:pgSz w:w="12240" w:h="15840"/>

</xml_diff>